<commit_message>
Update backend controllers, AI prompt, and project documentation
</commit_message>
<xml_diff>
--- a/docs/AI_Email_Intent_Classification.docx
+++ b/docs/AI_Email_Intent_Classification.docx
@@ -126,7 +126,16 @@
         <w:t>Frontend:</w:t>
       </w:r>
       <w:r>
-        <w:t> Angular (TypeScript), HTML5, CSS3/SCSS</w:t>
+        <w:t xml:space="preserve"> Angular </w:t>
+      </w:r>
+      <w:r>
+        <w:t>22.0.0-next.8</w:t>
+      </w:r>
+      <w:r>
+        <w:t xml:space="preserve"> </w:t>
+      </w:r>
+      <w:r>
+        <w:t>(TypeScript), HTML5, CSS3/SCSS</w:t>
       </w:r>
     </w:p>
     <w:p>
@@ -144,7 +153,13 @@
         <w:t>Backend:</w:t>
       </w:r>
       <w:r>
-        <w:t> ASP.NET Core Web API (C#)</w:t>
+        <w:t> ASP.NET Core Web API (</w:t>
+      </w:r>
+      <w:r>
+        <w:t>.NET 10.0.203,</w:t>
+      </w:r>
+      <w:r>
+        <w:t>C#)</w:t>
       </w:r>
     </w:p>
     <w:p>
@@ -398,6 +413,7 @@
       <w:r>
         <w:t>The system identifies the type of email, such as </w:t>
       </w:r>
+      <w:proofErr w:type="spellStart"/>
       <w:r>
         <w:rPr>
           <w:b/>
@@ -405,6 +421,7 @@
         </w:rPr>
         <w:t>DocCollection</w:t>
       </w:r>
+      <w:proofErr w:type="spellEnd"/>
       <w:r>
         <w:t> or </w:t>
       </w:r>
@@ -518,6 +535,7 @@
       <w:r>
         <w:t>Admin users can create and manage departments such as </w:t>
       </w:r>
+      <w:proofErr w:type="spellStart"/>
       <w:r>
         <w:rPr>
           <w:b/>
@@ -525,6 +543,7 @@
         </w:rPr>
         <w:t>DocCollection</w:t>
       </w:r>
+      <w:proofErr w:type="spellEnd"/>
       <w:r>
         <w:t> and </w:t>
       </w:r>
@@ -654,6 +673,13 @@
           <w:bCs/>
         </w:rPr>
         <w:t>Angular Frontend</w:t>
+      </w:r>
+      <w:r>
+        <w:rPr>
+          <w:b/>
+          <w:bCs/>
+        </w:rPr>
+        <w:t xml:space="preserve"> </w:t>
       </w:r>
     </w:p>
     <w:p>
@@ -679,12 +705,31 @@
       </w:r>
     </w:p>
     <w:p>
+      <w:pPr>
+        <w:tabs>
+          <w:tab w:val="center" w:pos="4680"/>
+        </w:tabs>
+      </w:pPr>
       <w:r>
         <w:rPr>
           <w:b/>
           <w:bCs/>
         </w:rPr>
         <w:t>ASP.NET Core Web API</w:t>
+      </w:r>
+      <w:r>
+        <w:rPr>
+          <w:b/>
+          <w:bCs/>
+        </w:rPr>
+        <w:t xml:space="preserve"> </w:t>
+      </w:r>
+      <w:r>
+        <w:rPr>
+          <w:b/>
+          <w:bCs/>
+        </w:rPr>
+        <w:tab/>
       </w:r>
     </w:p>
     <w:p>
@@ -1169,6 +1214,7 @@
       <w:r>
         <w:t>, and manage departments such as </w:t>
       </w:r>
+      <w:proofErr w:type="spellStart"/>
       <w:r>
         <w:rPr>
           <w:b/>
@@ -1176,6 +1222,7 @@
         </w:rPr>
         <w:t>DocCollection</w:t>
       </w:r>
+      <w:proofErr w:type="spellEnd"/>
       <w:r>
         <w:t> and </w:t>
       </w:r>
@@ -1578,7 +1625,15 @@
           </w:tcPr>
           <w:p>
             <w:r>
-              <w:t>/api/auth/login</w:t>
+              <w:t>/</w:t>
+            </w:r>
+            <w:proofErr w:type="spellStart"/>
+            <w:r>
+              <w:t>api</w:t>
+            </w:r>
+            <w:proofErr w:type="spellEnd"/>
+            <w:r>
+              <w:t>/auth/login</w:t>
             </w:r>
           </w:p>
         </w:tc>
@@ -1655,7 +1710,15 @@
           </w:tcPr>
           <w:p>
             <w:r>
-              <w:t>/api/departments</w:t>
+              <w:t>/</w:t>
+            </w:r>
+            <w:proofErr w:type="spellStart"/>
+            <w:r>
+              <w:t>api</w:t>
+            </w:r>
+            <w:proofErr w:type="spellEnd"/>
+            <w:r>
+              <w:t>/departments</w:t>
             </w:r>
           </w:p>
         </w:tc>
@@ -1732,7 +1795,15 @@
           </w:tcPr>
           <w:p>
             <w:r>
-              <w:t>/api/departments</w:t>
+              <w:t>/</w:t>
+            </w:r>
+            <w:proofErr w:type="spellStart"/>
+            <w:r>
+              <w:t>api</w:t>
+            </w:r>
+            <w:proofErr w:type="spellEnd"/>
+            <w:r>
+              <w:t>/departments</w:t>
             </w:r>
           </w:p>
         </w:tc>
@@ -1809,7 +1880,15 @@
           </w:tcPr>
           <w:p>
             <w:r>
-              <w:t>/api/departments/{id}</w:t>
+              <w:t>/</w:t>
+            </w:r>
+            <w:proofErr w:type="spellStart"/>
+            <w:r>
+              <w:t>api</w:t>
+            </w:r>
+            <w:proofErr w:type="spellEnd"/>
+            <w:r>
+              <w:t>/departments/{id}</w:t>
             </w:r>
           </w:p>
         </w:tc>
@@ -1886,7 +1965,15 @@
           </w:tcPr>
           <w:p>
             <w:r>
-              <w:t>/api/users</w:t>
+              <w:t>/</w:t>
+            </w:r>
+            <w:proofErr w:type="spellStart"/>
+            <w:r>
+              <w:t>api</w:t>
+            </w:r>
+            <w:proofErr w:type="spellEnd"/>
+            <w:r>
+              <w:t>/users</w:t>
             </w:r>
           </w:p>
         </w:tc>
@@ -1963,7 +2050,15 @@
           </w:tcPr>
           <w:p>
             <w:r>
-              <w:t>/api/users</w:t>
+              <w:t>/</w:t>
+            </w:r>
+            <w:proofErr w:type="spellStart"/>
+            <w:r>
+              <w:t>api</w:t>
+            </w:r>
+            <w:proofErr w:type="spellEnd"/>
+            <w:r>
+              <w:t>/users</w:t>
             </w:r>
           </w:p>
         </w:tc>
@@ -2040,7 +2135,15 @@
           </w:tcPr>
           <w:p>
             <w:r>
-              <w:t>/api/users/{id}</w:t>
+              <w:t>/</w:t>
+            </w:r>
+            <w:proofErr w:type="spellStart"/>
+            <w:r>
+              <w:t>api</w:t>
+            </w:r>
+            <w:proofErr w:type="spellEnd"/>
+            <w:r>
+              <w:t>/users/{id}</w:t>
             </w:r>
           </w:p>
         </w:tc>
@@ -2117,7 +2220,15 @@
           </w:tcPr>
           <w:p>
             <w:r>
-              <w:t>/api/emails</w:t>
+              <w:t>/</w:t>
+            </w:r>
+            <w:proofErr w:type="spellStart"/>
+            <w:r>
+              <w:t>api</w:t>
+            </w:r>
+            <w:proofErr w:type="spellEnd"/>
+            <w:r>
+              <w:t>/emails</w:t>
             </w:r>
           </w:p>
         </w:tc>
@@ -2194,7 +2305,15 @@
           </w:tcPr>
           <w:p>
             <w:r>
-              <w:t>/api/emails/{id}</w:t>
+              <w:t>/</w:t>
+            </w:r>
+            <w:proofErr w:type="spellStart"/>
+            <w:r>
+              <w:t>api</w:t>
+            </w:r>
+            <w:proofErr w:type="spellEnd"/>
+            <w:r>
+              <w:t>/emails/{id}</w:t>
             </w:r>
           </w:p>
         </w:tc>
@@ -2272,7 +2391,15 @@
           </w:tcPr>
           <w:p>
             <w:r>
-              <w:t>/api/emails</w:t>
+              <w:t>/</w:t>
+            </w:r>
+            <w:proofErr w:type="spellStart"/>
+            <w:r>
+              <w:t>api</w:t>
+            </w:r>
+            <w:proofErr w:type="spellEnd"/>
+            <w:r>
+              <w:t>/emails</w:t>
             </w:r>
           </w:p>
         </w:tc>
@@ -2349,7 +2476,15 @@
           </w:tcPr>
           <w:p>
             <w:r>
-              <w:t>/api/emails/{id}</w:t>
+              <w:t>/</w:t>
+            </w:r>
+            <w:proofErr w:type="spellStart"/>
+            <w:r>
+              <w:t>api</w:t>
+            </w:r>
+            <w:proofErr w:type="spellEnd"/>
+            <w:r>
+              <w:t>/emails/{id}</w:t>
             </w:r>
           </w:p>
         </w:tc>
@@ -2426,7 +2561,15 @@
           </w:tcPr>
           <w:p>
             <w:r>
-              <w:t>/api/routing-rules</w:t>
+              <w:t>/</w:t>
+            </w:r>
+            <w:proofErr w:type="spellStart"/>
+            <w:r>
+              <w:t>api</w:t>
+            </w:r>
+            <w:proofErr w:type="spellEnd"/>
+            <w:r>
+              <w:t>/routing-rules</w:t>
             </w:r>
           </w:p>
         </w:tc>
@@ -2503,7 +2646,15 @@
           </w:tcPr>
           <w:p>
             <w:r>
-              <w:t>/api/routing-rules</w:t>
+              <w:t>/</w:t>
+            </w:r>
+            <w:proofErr w:type="spellStart"/>
+            <w:r>
+              <w:t>api</w:t>
+            </w:r>
+            <w:proofErr w:type="spellEnd"/>
+            <w:r>
+              <w:t>/routing-rules</w:t>
             </w:r>
           </w:p>
         </w:tc>
@@ -2580,7 +2731,15 @@
           </w:tcPr>
           <w:p>
             <w:r>
-              <w:t>/api/routing-rules/{id}</w:t>
+              <w:t>/</w:t>
+            </w:r>
+            <w:proofErr w:type="spellStart"/>
+            <w:r>
+              <w:t>api</w:t>
+            </w:r>
+            <w:proofErr w:type="spellEnd"/>
+            <w:r>
+              <w:t>/routing-rules/{id}</w:t>
             </w:r>
           </w:p>
         </w:tc>
@@ -2657,7 +2816,15 @@
           </w:tcPr>
           <w:p>
             <w:r>
-              <w:t>/api/routing-rules/{id}</w:t>
+              <w:t>/</w:t>
+            </w:r>
+            <w:proofErr w:type="spellStart"/>
+            <w:r>
+              <w:t>api</w:t>
+            </w:r>
+            <w:proofErr w:type="spellEnd"/>
+            <w:r>
+              <w:t>/routing-rules/{id}</w:t>
             </w:r>
           </w:p>
         </w:tc>
@@ -2734,7 +2901,15 @@
           </w:tcPr>
           <w:p>
             <w:r>
-              <w:t>/api/classification/process</w:t>
+              <w:t>/</w:t>
+            </w:r>
+            <w:proofErr w:type="spellStart"/>
+            <w:r>
+              <w:t>api</w:t>
+            </w:r>
+            <w:proofErr w:type="spellEnd"/>
+            <w:r>
+              <w:t>/classification/process</w:t>
             </w:r>
           </w:p>
         </w:tc>
@@ -2811,7 +2986,15 @@
           </w:tcPr>
           <w:p>
             <w:r>
-              <w:t>/api/manual-review</w:t>
+              <w:t>/</w:t>
+            </w:r>
+            <w:proofErr w:type="spellStart"/>
+            <w:r>
+              <w:t>api</w:t>
+            </w:r>
+            <w:proofErr w:type="spellEnd"/>
+            <w:r>
+              <w:t>/manual-review</w:t>
             </w:r>
           </w:p>
         </w:tc>
@@ -2888,7 +3071,15 @@
           </w:tcPr>
           <w:p>
             <w:r>
-              <w:t>/api/manual-review/{id}/assign</w:t>
+              <w:t>/</w:t>
+            </w:r>
+            <w:proofErr w:type="spellStart"/>
+            <w:r>
+              <w:t>api</w:t>
+            </w:r>
+            <w:proofErr w:type="spellEnd"/>
+            <w:r>
+              <w:t>/manual-review/{id}/assign</w:t>
             </w:r>
           </w:p>
         </w:tc>
@@ -2965,7 +3156,15 @@
           </w:tcPr>
           <w:p>
             <w:r>
-              <w:t>/api/department-queue</w:t>
+              <w:t>/</w:t>
+            </w:r>
+            <w:proofErr w:type="spellStart"/>
+            <w:r>
+              <w:t>api</w:t>
+            </w:r>
+            <w:proofErr w:type="spellEnd"/>
+            <w:r>
+              <w:t>/department-queue</w:t>
             </w:r>
           </w:p>
         </w:tc>
@@ -3042,7 +3241,15 @@
           </w:tcPr>
           <w:p>
             <w:r>
-              <w:t>/api/department-queue/{id}/status</w:t>
+              <w:t>/</w:t>
+            </w:r>
+            <w:proofErr w:type="spellStart"/>
+            <w:r>
+              <w:t>api</w:t>
+            </w:r>
+            <w:proofErr w:type="spellEnd"/>
+            <w:r>
+              <w:t>/department-queue/{id}/status</w:t>
             </w:r>
           </w:p>
         </w:tc>
@@ -3118,7 +3325,15 @@
     </w:p>
     <w:p>
       <w:r>
-        <w:t xml:space="preserve">  "clientName": "John Doe"</w:t>
+        <w:t xml:space="preserve">  "</w:t>
+      </w:r>
+      <w:proofErr w:type="spellStart"/>
+      <w:r>
+        <w:t>clientName</w:t>
+      </w:r>
+      <w:proofErr w:type="spellEnd"/>
+      <w:r>
+        <w:t>": "John Doe"</w:t>
       </w:r>
     </w:p>
     <w:p>
@@ -6198,7 +6413,6 @@
   <w:style w:type="character" w:default="1" w:styleId="DefaultParagraphFont">
     <w:name w:val="Default Paragraph Font"/>
     <w:uiPriority w:val="1"/>
-    <w:semiHidden/>
     <w:unhideWhenUsed/>
   </w:style>
   <w:style w:type="table" w:default="1" w:styleId="TableNormal">

</xml_diff>